<commit_message>
sistema de cursos completado
</commit_message>
<xml_diff>
--- a/DOCUMENTACION/USUARIOS DOCUMENTACION.docx
+++ b/DOCUMENTACION/USUARIOS DOCUMENTACION.docx
@@ -1,6 +1,6 @@
 
 <file path=word/document.xml><?xml version="1.0" encoding="utf-8"?>
-<w:document xmlns:wpc="http://schemas.microsoft.com/office/word/2010/wordprocessingCanvas" xmlns:cx="http://schemas.microsoft.com/office/drawing/2014/chartex" xmlns:cx1="http://schemas.microsoft.com/office/drawing/2015/9/8/chartex" xmlns:cx2="http://schemas.microsoft.com/office/drawing/2015/10/21/chartex" xmlns:cx3="http://schemas.microsoft.com/office/drawing/2016/5/9/chartex" xmlns:cx4="http://schemas.microsoft.com/office/drawing/2016/5/10/chartex" xmlns:cx5="http://schemas.microsoft.com/office/drawing/2016/5/11/chartex" xmlns:cx6="http://schemas.microsoft.com/office/drawing/2016/5/12/chartex" xmlns:cx7="http://schemas.microsoft.com/office/drawing/2016/5/13/chartex" xmlns:cx8="http://schemas.microsoft.com/office/drawing/2016/5/14/chartex" xmlns:mc="http://schemas.openxmlformats.org/markup-compatibility/2006" xmlns:aink="http://schemas.microsoft.com/office/drawing/2016/ink" xmlns:am3d="http://schemas.microsoft.com/office/drawing/2017/model3d" xmlns:o="urn:schemas-microsoft-com:office:office" xmlns:oel="http://schemas.microsoft.com/office/2019/extlst" xmlns:r="http://schemas.openxmlformats.org/officeDocument/2006/relationships" xmlns:m="http://schemas.openxmlformats.org/officeDocument/2006/math" xmlns:v="urn:schemas-microsoft-com:vml" xmlns:wp14="http://schemas.microsoft.com/office/word/2010/wordprocessingDrawing" xmlns:wp="http://schemas.openxmlformats.org/drawingml/2006/wordprocessingDrawing" xmlns:w10="urn:schemas-microsoft-com:office:word" xmlns:w="http://schemas.openxmlformats.org/wordprocessingml/2006/main" xmlns:w14="http://schemas.microsoft.com/office/word/2010/wordml" xmlns:w15="http://schemas.microsoft.com/office/word/2012/wordml" xmlns:w16cex="http://schemas.microsoft.com/office/word/2018/wordml/cex" xmlns:w16cid="http://schemas.microsoft.com/office/word/2016/wordml/cid" xmlns:w16="http://schemas.microsoft.com/office/word/2018/wordml" xmlns:w16du="http://schemas.microsoft.com/office/word/2023/wordml/word16du" xmlns:w16sdtdh="http://schemas.microsoft.com/office/word/2020/wordml/sdtdatahash" xmlns:w16sdtfl="http://schemas.microsoft.com/office/word/2024/wordml/sdtformatlock" xmlns:w16se="http://schemas.microsoft.com/office/word/2015/wordml/symex" xmlns:wpg="http://schemas.microsoft.com/office/word/2010/wordprocessingGroup" xmlns:wpi="http://schemas.microsoft.com/office/word/2010/wordprocessingInk" xmlns:wne="http://schemas.microsoft.com/office/word/2006/wordml" xmlns:wps="http://schemas.microsoft.com/office/word/2010/wordprocessingShape" mc:Ignorable="w14 w15 w16se w16cid w16 w16cex w16sdtdh w16sdtfl w16du wp14">
+<w:document xmlns:wpc="http://schemas.microsoft.com/office/word/2010/wordprocessingCanvas" xmlns:cx="http://schemas.microsoft.com/office/drawing/2014/chartex" xmlns:cx1="http://schemas.microsoft.com/office/drawing/2015/9/8/chartex" xmlns:cx2="http://schemas.microsoft.com/office/drawing/2015/10/21/chartex" xmlns:cx3="http://schemas.microsoft.com/office/drawing/2016/5/9/chartex" xmlns:cx4="http://schemas.microsoft.com/office/drawing/2016/5/10/chartex" xmlns:cx5="http://schemas.microsoft.com/office/drawing/2016/5/11/chartex" xmlns:cx6="http://schemas.microsoft.com/office/drawing/2016/5/12/chartex" xmlns:cx7="http://schemas.microsoft.com/office/drawing/2016/5/13/chartex" xmlns:cx8="http://schemas.microsoft.com/office/drawing/2016/5/14/chartex" xmlns:mc="http://schemas.openxmlformats.org/markup-compatibility/2006" xmlns:aink="http://schemas.microsoft.com/office/drawing/2016/ink" xmlns:am3d="http://schemas.microsoft.com/office/drawing/2017/model3d" xmlns:o="urn:schemas-microsoft-com:office:office" xmlns:oel="http://schemas.microsoft.com/office/2019/extlst" xmlns:r="http://schemas.openxmlformats.org/officeDocument/2006/relationships" xmlns:m="http://schemas.openxmlformats.org/officeDocument/2006/math" xmlns:v="urn:schemas-microsoft-com:vml" xmlns:wp14="http://schemas.microsoft.com/office/word/2010/wordprocessingDrawing" xmlns:wp="http://schemas.openxmlformats.org/drawingml/2006/wordprocessingDrawing" xmlns:w10="urn:schemas-microsoft-com:office:word" xmlns:w="http://schemas.openxmlformats.org/wordprocessingml/2006/main" xmlns:w14="http://schemas.microsoft.com/office/word/2010/wordml" xmlns:w15="http://schemas.microsoft.com/office/word/2012/wordml" xmlns:w16cex="http://schemas.microsoft.com/office/word/2018/wordml/cex" xmlns:w16cid="http://schemas.microsoft.com/office/word/2016/wordml/cid" xmlns:w16="http://schemas.microsoft.com/office/word/2018/wordml" xmlns:w16sdtdh="http://schemas.microsoft.com/office/word/2020/wordml/sdtdatahash" xmlns:w16se="http://schemas.microsoft.com/office/word/2015/wordml/symex" xmlns:wpg="http://schemas.microsoft.com/office/word/2010/wordprocessingGroup" xmlns:wpi="http://schemas.microsoft.com/office/word/2010/wordprocessingInk" xmlns:wne="http://schemas.microsoft.com/office/word/2006/wordml" xmlns:wps="http://schemas.microsoft.com/office/word/2010/wordprocessingShape" mc:Ignorable="w14 w15 w16se w16cid w16 w16cex w16sdtdh wp14">
   <w:body>
     <w:p>
       <w:pPr>
@@ -40,7 +40,7 @@
                     <pic:cNvPicPr/>
                   </pic:nvPicPr>
                   <pic:blipFill>
-                    <a:blip r:embed="rId4">
+                    <a:blip r:embed="rId6">
                       <a:extLst>
                         <a:ext uri="{28A0092B-C50C-407E-A947-70E740481C1C}">
                           <a14:useLocalDpi xmlns:a14="http://schemas.microsoft.com/office/drawing/2010/main" val="0"/>
@@ -72,31 +72,13 @@
           </wp:anchor>
         </w:drawing>
       </w:r>
-      <w:proofErr w:type="spellStart"/>
       <w:r>
         <w:rPr>
           <w:b/>
           <w:bCs/>
         </w:rPr>
-        <w:t>Modificacion</w:t>
-      </w:r>
-      <w:proofErr w:type="spellEnd"/>
-      <w:r>
-        <w:rPr>
-          <w:b/>
-          <w:bCs/>
-        </w:rPr>
-        <w:t xml:space="preserve"> </w:t>
-      </w:r>
-      <w:proofErr w:type="spellStart"/>
-      <w:r>
-        <w:rPr>
-          <w:b/>
-          <w:bCs/>
-        </w:rPr>
-        <w:t>sidebar</w:t>
-      </w:r>
-      <w:proofErr w:type="spellEnd"/>
+        <w:t>Modificacion sidebar</w:t>
+      </w:r>
     </w:p>
     <w:p>
       <w:r>
@@ -127,7 +109,7 @@
                     <pic:cNvPicPr/>
                   </pic:nvPicPr>
                   <pic:blipFill>
-                    <a:blip r:embed="rId5">
+                    <a:blip r:embed="rId7">
                       <a:extLst>
                         <a:ext uri="{28A0092B-C50C-407E-A947-70E740481C1C}">
                           <a14:useLocalDpi xmlns:a14="http://schemas.microsoft.com/office/drawing/2010/main" val="0"/>
@@ -207,7 +189,7 @@
                     <pic:cNvPicPr/>
                   </pic:nvPicPr>
                   <pic:blipFill>
-                    <a:blip r:embed="rId6">
+                    <a:blip r:embed="rId8">
                       <a:extLst>
                         <a:ext uri="{28A0092B-C50C-407E-A947-70E740481C1C}">
                           <a14:useLocalDpi xmlns:a14="http://schemas.microsoft.com/office/drawing/2010/main" val="0"/>
@@ -278,7 +260,7 @@
                     <pic:cNvPicPr/>
                   </pic:nvPicPr>
                   <pic:blipFill>
-                    <a:blip r:embed="rId7">
+                    <a:blip r:embed="rId9">
                       <a:extLst>
                         <a:ext uri="{28A0092B-C50C-407E-A947-70E740481C1C}">
                           <a14:useLocalDpi xmlns:a14="http://schemas.microsoft.com/office/drawing/2010/main" val="0"/>
@@ -312,19 +294,9 @@
       </w:r>
     </w:p>
     <w:p>
-      <w:proofErr w:type="spellStart"/>
-      <w:r>
-        <w:t>Admin</w:t>
-      </w:r>
-      <w:proofErr w:type="spellEnd"/>
-      <w:r>
-        <w:t xml:space="preserve"> / </w:t>
-      </w:r>
-      <w:proofErr w:type="spellStart"/>
-      <w:r>
-        <w:t>breadcrumb</w:t>
-      </w:r>
-      <w:proofErr w:type="spellEnd"/>
+      <w:r>
+        <w:t>Admin / breadcrumb</w:t>
+      </w:r>
     </w:p>
     <w:p/>
     <w:p>
@@ -356,7 +328,7 @@
                     <pic:cNvPicPr/>
                   </pic:nvPicPr>
                   <pic:blipFill>
-                    <a:blip r:embed="rId8">
+                    <a:blip r:embed="rId10">
                       <a:extLst>
                         <a:ext uri="{28A0092B-C50C-407E-A947-70E740481C1C}">
                           <a14:useLocalDpi xmlns:a14="http://schemas.microsoft.com/office/drawing/2010/main" val="0"/>
@@ -425,7 +397,7 @@
           <w:tab w:val="left" w:pos="5568"/>
         </w:tabs>
       </w:pPr>
-      <w:hyperlink r:id="rId9" w:history="1">
+      <w:hyperlink r:id="rId11" w:history="1">
         <w:r>
           <w:rPr>
             <w:rStyle w:val="Hipervnculo"/>
@@ -447,45 +419,8 @@
           <w:tab w:val="left" w:pos="5568"/>
         </w:tabs>
       </w:pPr>
-      <w:proofErr w:type="spellStart"/>
-      <w:r>
-        <w:t>composer</w:t>
-      </w:r>
-      <w:proofErr w:type="spellEnd"/>
-      <w:r>
-        <w:t xml:space="preserve"> </w:t>
-      </w:r>
-      <w:proofErr w:type="spellStart"/>
-      <w:r>
-        <w:t>require</w:t>
-      </w:r>
-      <w:proofErr w:type="spellEnd"/>
-      <w:r>
-        <w:t xml:space="preserve"> </w:t>
-      </w:r>
-      <w:proofErr w:type="spellStart"/>
-      <w:r>
-        <w:t>rappasoft</w:t>
-      </w:r>
-      <w:proofErr w:type="spellEnd"/>
-      <w:r>
-        <w:t>/</w:t>
-      </w:r>
-      <w:proofErr w:type="spellStart"/>
-      <w:r>
-        <w:t>laravel</w:t>
-      </w:r>
-      <w:proofErr w:type="spellEnd"/>
-      <w:r>
-        <w:t>-</w:t>
-      </w:r>
-      <w:proofErr w:type="spellStart"/>
-      <w:r>
-        <w:t>livewire</w:t>
-      </w:r>
-      <w:proofErr w:type="spellEnd"/>
-      <w:r>
-        <w:t>-tables</w:t>
+      <w:r>
+        <w:t>composer require rappasoft/laravel-livewire-tables</w:t>
       </w:r>
     </w:p>
     <w:p>
@@ -508,7 +443,7 @@
           <w:tab w:val="left" w:pos="5568"/>
         </w:tabs>
       </w:pPr>
-      <w:hyperlink r:id="rId10" w:history="1">
+      <w:hyperlink r:id="rId12" w:history="1">
         <w:r>
           <w:rPr>
             <w:rStyle w:val="Hipervnculo"/>
@@ -523,45 +458,9 @@
           <w:tab w:val="left" w:pos="5568"/>
         </w:tabs>
       </w:pPr>
-      <w:proofErr w:type="spellStart"/>
-      <w:r>
-        <w:t>php</w:t>
-      </w:r>
-      <w:proofErr w:type="spellEnd"/>
-      <w:r>
-        <w:t xml:space="preserve"> </w:t>
-      </w:r>
-      <w:proofErr w:type="spellStart"/>
-      <w:r>
-        <w:t>artisan</w:t>
-      </w:r>
-      <w:proofErr w:type="spellEnd"/>
-      <w:r>
-        <w:t xml:space="preserve"> </w:t>
-      </w:r>
-      <w:proofErr w:type="spellStart"/>
-      <w:proofErr w:type="gramStart"/>
-      <w:r>
-        <w:t>vendor:publish</w:t>
-      </w:r>
-      <w:proofErr w:type="spellEnd"/>
-      <w:proofErr w:type="gramEnd"/>
-      <w:r>
-        <w:t xml:space="preserve"> --provider="Rappasoft\LaravelLivewireTables\LaravelLivewireTablesServiceProvider" --tag=</w:t>
-      </w:r>
-      <w:proofErr w:type="spellStart"/>
-      <w:r>
-        <w:t>livewire</w:t>
-      </w:r>
-      <w:proofErr w:type="spellEnd"/>
-      <w:r>
-        <w:t>-tables-</w:t>
-      </w:r>
-      <w:proofErr w:type="spellStart"/>
-      <w:r>
-        <w:t>translations</w:t>
-      </w:r>
-      <w:proofErr w:type="spellEnd"/>
+      <w:r>
+        <w:t>php artisan vendor:publish --provider="Rappasoft\LaravelLivewireTables\LaravelLivewireTablesServiceProvider" --tag=livewire-tables-translations</w:t>
+      </w:r>
     </w:p>
     <w:p>
       <w:pPr>
@@ -584,13 +483,8 @@
         </w:tabs>
       </w:pPr>
       <w:r>
-        <w:t xml:space="preserve">poner esto en </w:t>
-      </w:r>
-      <w:proofErr w:type="spellStart"/>
-      <w:r>
-        <w:t>tailwind</w:t>
-      </w:r>
-      <w:proofErr w:type="spellEnd"/>
+        <w:t>poner esto en tailwind</w:t>
+      </w:r>
     </w:p>
     <w:p>
       <w:pPr>
@@ -608,15 +502,8 @@
           <w:tab w:val="left" w:pos="5568"/>
         </w:tabs>
       </w:pPr>
-      <w:proofErr w:type="spellStart"/>
-      <w:proofErr w:type="gramStart"/>
-      <w:r>
-        <w:t>module.exports</w:t>
-      </w:r>
-      <w:proofErr w:type="spellEnd"/>
-      <w:proofErr w:type="gramEnd"/>
-      <w:r>
-        <w:t xml:space="preserve"> = {</w:t>
+      <w:r>
+        <w:t>module.exports = {</w:t>
       </w:r>
     </w:p>
     <w:p>
@@ -626,15 +513,7 @@
         </w:tabs>
       </w:pPr>
       <w:r>
-        <w:t xml:space="preserve">    </w:t>
-      </w:r>
-      <w:proofErr w:type="spellStart"/>
-      <w:r>
-        <w:t>content</w:t>
-      </w:r>
-      <w:proofErr w:type="spellEnd"/>
-      <w:r>
-        <w:t>: [</w:t>
+        <w:t xml:space="preserve">    content: [</w:t>
       </w:r>
     </w:p>
     <w:p>
@@ -654,15 +533,7 @@
         </w:tabs>
       </w:pPr>
       <w:r>
-        <w:t xml:space="preserve">        </w:t>
-      </w:r>
-      <w:proofErr w:type="gramStart"/>
-      <w:r>
-        <w:t>'./</w:t>
-      </w:r>
-      <w:proofErr w:type="gramEnd"/>
-      <w:r>
-        <w:t>vendor/rappasoft/laravel-livewire-tables/resources/views/**/*.blade.php',</w:t>
+        <w:t xml:space="preserve">        './vendor/rappasoft/laravel-livewire-tables/resources/views/**/*.blade.php',</w:t>
       </w:r>
     </w:p>
     <w:p>
@@ -691,63 +562,11 @@
           <w:tab w:val="left" w:pos="5568"/>
         </w:tabs>
       </w:pPr>
-      <w:proofErr w:type="spellStart"/>
       <w:r>
         <w:rPr>
           <w:highlight w:val="yellow"/>
         </w:rPr>
-        <w:t>php</w:t>
-      </w:r>
-      <w:proofErr w:type="spellEnd"/>
-      <w:r>
-        <w:rPr>
-          <w:highlight w:val="yellow"/>
-        </w:rPr>
-        <w:t xml:space="preserve"> </w:t>
-      </w:r>
-      <w:proofErr w:type="spellStart"/>
-      <w:r>
-        <w:rPr>
-          <w:highlight w:val="yellow"/>
-        </w:rPr>
-        <w:t>artisan</w:t>
-      </w:r>
-      <w:proofErr w:type="spellEnd"/>
-      <w:r>
-        <w:rPr>
-          <w:highlight w:val="yellow"/>
-        </w:rPr>
-        <w:t xml:space="preserve"> </w:t>
-      </w:r>
-      <w:proofErr w:type="spellStart"/>
-      <w:proofErr w:type="gramStart"/>
-      <w:r>
-        <w:rPr>
-          <w:highlight w:val="yellow"/>
-        </w:rPr>
-        <w:t>make:datatable</w:t>
-      </w:r>
-      <w:proofErr w:type="spellEnd"/>
-      <w:proofErr w:type="gramEnd"/>
-      <w:r>
-        <w:rPr>
-          <w:highlight w:val="yellow"/>
-        </w:rPr>
-        <w:t xml:space="preserve"> </w:t>
-      </w:r>
-      <w:proofErr w:type="spellStart"/>
-      <w:r>
-        <w:rPr>
-          <w:highlight w:val="yellow"/>
-        </w:rPr>
-        <w:t>UserTable</w:t>
-      </w:r>
-      <w:proofErr w:type="spellEnd"/>
-      <w:r>
-        <w:rPr>
-          <w:highlight w:val="yellow"/>
-        </w:rPr>
-        <w:t xml:space="preserve"> User</w:t>
+        <w:t>php artisan make:datatable UserTable User</w:t>
       </w:r>
     </w:p>
     <w:p>
@@ -784,7 +603,7 @@
                     <pic:cNvPicPr/>
                   </pic:nvPicPr>
                   <pic:blipFill>
-                    <a:blip r:embed="rId11">
+                    <a:blip r:embed="rId13">
                       <a:extLst>
                         <a:ext uri="{28A0092B-C50C-407E-A947-70E740481C1C}">
                           <a14:useLocalDpi xmlns:a14="http://schemas.microsoft.com/office/drawing/2010/main" val="0"/>
@@ -908,7 +727,7 @@
                     <pic:cNvPicPr/>
                   </pic:nvPicPr>
                   <pic:blipFill>
-                    <a:blip r:embed="rId12">
+                    <a:blip r:embed="rId14">
                       <a:extLst>
                         <a:ext uri="{28A0092B-C50C-407E-A947-70E740481C1C}">
                           <a14:useLocalDpi xmlns:a14="http://schemas.microsoft.com/office/drawing/2010/main" val="0"/>
@@ -940,19 +759,9 @@
           </wp:anchor>
         </w:drawing>
       </w:r>
-      <w:proofErr w:type="spellStart"/>
-      <w:r>
-        <w:t>Aca</w:t>
-      </w:r>
-      <w:proofErr w:type="spellEnd"/>
-      <w:r>
-        <w:t xml:space="preserve"> esta el </w:t>
-      </w:r>
-      <w:proofErr w:type="spellStart"/>
-      <w:r>
-        <w:t>userTable</w:t>
-      </w:r>
-      <w:proofErr w:type="spellEnd"/>
+      <w:r>
+        <w:t>Aca esta el userTable</w:t>
+      </w:r>
     </w:p>
     <w:p>
       <w:pPr>
@@ -1001,7 +810,7 @@
                     <pic:cNvPicPr/>
                   </pic:nvPicPr>
                   <pic:blipFill>
-                    <a:blip r:embed="rId13">
+                    <a:blip r:embed="rId15">
                       <a:extLst>
                         <a:ext uri="{28A0092B-C50C-407E-A947-70E740481C1C}">
                           <a14:useLocalDpi xmlns:a14="http://schemas.microsoft.com/office/drawing/2010/main" val="0"/>
@@ -1061,7 +870,7 @@
                     <pic:cNvPicPr/>
                   </pic:nvPicPr>
                   <pic:blipFill>
-                    <a:blip r:embed="rId14">
+                    <a:blip r:embed="rId16">
                       <a:extLst>
                         <a:ext uri="{28A0092B-C50C-407E-A947-70E740481C1C}">
                           <a14:useLocalDpi xmlns:a14="http://schemas.microsoft.com/office/drawing/2010/main" val="0"/>
@@ -1133,12 +942,10 @@
           <w:tab w:val="left" w:pos="1320"/>
         </w:tabs>
       </w:pPr>
-      <w:proofErr w:type="spellStart"/>
       <w:r>
         <w:lastRenderedPageBreak/>
         <w:t>action</w:t>
       </w:r>
-      <w:proofErr w:type="spellEnd"/>
     </w:p>
     <w:p>
       <w:pPr>
@@ -1177,7 +984,7 @@
                     <pic:cNvPicPr/>
                   </pic:nvPicPr>
                   <pic:blipFill>
-                    <a:blip r:embed="rId15">
+                    <a:blip r:embed="rId17">
                       <a:extLst>
                         <a:ext uri="{28A0092B-C50C-407E-A947-70E740481C1C}">
                           <a14:useLocalDpi xmlns:a14="http://schemas.microsoft.com/office/drawing/2010/main" val="0"/>
@@ -1229,7 +1036,7 @@
                     <pic:cNvPicPr/>
                   </pic:nvPicPr>
                   <pic:blipFill>
-                    <a:blip r:embed="rId16"/>
+                    <a:blip r:embed="rId18"/>
                     <a:stretch>
                       <a:fillRect/>
                     </a:stretch>
@@ -1289,7 +1096,7 @@
                     <pic:cNvPicPr/>
                   </pic:nvPicPr>
                   <pic:blipFill>
-                    <a:blip r:embed="rId17">
+                    <a:blip r:embed="rId19">
                       <a:extLst>
                         <a:ext uri="{28A0092B-C50C-407E-A947-70E740481C1C}">
                           <a14:useLocalDpi xmlns:a14="http://schemas.microsoft.com/office/drawing/2010/main" val="0"/>
@@ -1349,7 +1156,7 @@
                     <pic:cNvPicPr/>
                   </pic:nvPicPr>
                   <pic:blipFill>
-                    <a:blip r:embed="rId18">
+                    <a:blip r:embed="rId20">
                       <a:extLst>
                         <a:ext uri="{28A0092B-C50C-407E-A947-70E740481C1C}">
                           <a14:useLocalDpi xmlns:a14="http://schemas.microsoft.com/office/drawing/2010/main" val="0"/>
@@ -1446,7 +1253,7 @@
                     <pic:cNvPicPr/>
                   </pic:nvPicPr>
                   <pic:blipFill>
-                    <a:blip r:embed="rId19">
+                    <a:blip r:embed="rId21">
                       <a:extLst>
                         <a:ext uri="{28A0092B-C50C-407E-A947-70E740481C1C}">
                           <a14:useLocalDpi xmlns:a14="http://schemas.microsoft.com/office/drawing/2010/main" val="0"/>
@@ -1524,7 +1331,7 @@
                     <pic:cNvPicPr/>
                   </pic:nvPicPr>
                   <pic:blipFill>
-                    <a:blip r:embed="rId20">
+                    <a:blip r:embed="rId22">
                       <a:extLst>
                         <a:ext uri="{28A0092B-C50C-407E-A947-70E740481C1C}">
                           <a14:useLocalDpi xmlns:a14="http://schemas.microsoft.com/office/drawing/2010/main" val="0"/>
@@ -1584,7 +1391,7 @@
                     <pic:cNvPicPr/>
                   </pic:nvPicPr>
                   <pic:blipFill>
-                    <a:blip r:embed="rId21">
+                    <a:blip r:embed="rId23">
                       <a:extLst>
                         <a:ext uri="{28A0092B-C50C-407E-A947-70E740481C1C}">
                           <a14:useLocalDpi xmlns:a14="http://schemas.microsoft.com/office/drawing/2010/main" val="0"/>
@@ -1666,7 +1473,7 @@
                     <pic:cNvPicPr/>
                   </pic:nvPicPr>
                   <pic:blipFill>
-                    <a:blip r:embed="rId22">
+                    <a:blip r:embed="rId24">
                       <a:extLst>
                         <a:ext uri="{28A0092B-C50C-407E-A947-70E740481C1C}">
                           <a14:useLocalDpi xmlns:a14="http://schemas.microsoft.com/office/drawing/2010/main" val="0"/>
@@ -1745,7 +1552,7 @@
                     <pic:cNvPicPr/>
                   </pic:nvPicPr>
                   <pic:blipFill>
-                    <a:blip r:embed="rId23">
+                    <a:blip r:embed="rId25">
                       <a:extLst>
                         <a:ext uri="{28A0092B-C50C-407E-A947-70E740481C1C}">
                           <a14:useLocalDpi xmlns:a14="http://schemas.microsoft.com/office/drawing/2010/main" val="0"/>
@@ -1889,7 +1696,7 @@
                     <pic:cNvPicPr/>
                   </pic:nvPicPr>
                   <pic:blipFill>
-                    <a:blip r:embed="rId24">
+                    <a:blip r:embed="rId26">
                       <a:extLst>
                         <a:ext uri="{28A0092B-C50C-407E-A947-70E740481C1C}">
                           <a14:useLocalDpi xmlns:a14="http://schemas.microsoft.com/office/drawing/2010/main" val="0"/>
@@ -1972,7 +1779,7 @@
                     <pic:cNvPicPr/>
                   </pic:nvPicPr>
                   <pic:blipFill>
-                    <a:blip r:embed="rId25">
+                    <a:blip r:embed="rId27">
                       <a:extLst>
                         <a:ext uri="{28A0092B-C50C-407E-A947-70E740481C1C}">
                           <a14:useLocalDpi xmlns:a14="http://schemas.microsoft.com/office/drawing/2010/main" val="0"/>
@@ -2056,7 +1863,7 @@
                     <pic:cNvPicPr/>
                   </pic:nvPicPr>
                   <pic:blipFill>
-                    <a:blip r:embed="rId26">
+                    <a:blip r:embed="rId28">
                       <a:extLst>
                         <a:ext uri="{28A0092B-C50C-407E-A947-70E740481C1C}">
                           <a14:useLocalDpi xmlns:a14="http://schemas.microsoft.com/office/drawing/2010/main" val="0"/>
@@ -2093,7 +1900,7 @@
           </wp:anchor>
         </w:drawing>
       </w:r>
-      <w:hyperlink r:id="rId27" w:history="1">
+      <w:hyperlink r:id="rId29" w:history="1">
         <w:r>
           <w:rPr>
             <w:rStyle w:val="Hipervnculo"/>
@@ -2136,7 +1943,7 @@
                     <pic:cNvPicPr/>
                   </pic:nvPicPr>
                   <pic:blipFill>
-                    <a:blip r:embed="rId28">
+                    <a:blip r:embed="rId30">
                       <a:extLst>
                         <a:ext uri="{28A0092B-C50C-407E-A947-70E740481C1C}">
                           <a14:useLocalDpi xmlns:a14="http://schemas.microsoft.com/office/drawing/2010/main" val="0"/>
@@ -2234,7 +2041,7 @@
                     <pic:cNvPicPr/>
                   </pic:nvPicPr>
                   <pic:blipFill>
-                    <a:blip r:embed="rId29">
+                    <a:blip r:embed="rId31">
                       <a:extLst>
                         <a:ext uri="{28A0092B-C50C-407E-A947-70E740481C1C}">
                           <a14:useLocalDpi xmlns:a14="http://schemas.microsoft.com/office/drawing/2010/main" val="0"/>
@@ -2296,23 +2103,8 @@
       </w:r>
     </w:p>
     <w:p>
-      <w:proofErr w:type="spellStart"/>
-      <w:proofErr w:type="gramStart"/>
-      <w:r>
-        <w:t>User</w:t>
-      </w:r>
-      <w:proofErr w:type="spellEnd"/>
-      <w:r>
-        <w:t>::</w:t>
-      </w:r>
-      <w:proofErr w:type="spellStart"/>
-      <w:proofErr w:type="gramEnd"/>
-      <w:r>
-        <w:t>create</w:t>
-      </w:r>
-      <w:proofErr w:type="spellEnd"/>
-      <w:r>
-        <w:t>($data);</w:t>
+      <w:r>
+        <w:t>User::create($data);</w:t>
       </w:r>
     </w:p>
     <w:p>
@@ -2392,33 +2184,7 @@
     </w:p>
     <w:p>
       <w:r>
-        <w:t>$</w:t>
-      </w:r>
-      <w:proofErr w:type="spellStart"/>
-      <w:r>
-        <w:t>user</w:t>
-      </w:r>
-      <w:proofErr w:type="spellEnd"/>
-      <w:r>
-        <w:t xml:space="preserve"> = </w:t>
-      </w:r>
-      <w:proofErr w:type="spellStart"/>
-      <w:proofErr w:type="gramStart"/>
-      <w:r>
-        <w:t>User</w:t>
-      </w:r>
-      <w:proofErr w:type="spellEnd"/>
-      <w:r>
-        <w:t>::</w:t>
-      </w:r>
-      <w:proofErr w:type="spellStart"/>
-      <w:proofErr w:type="gramEnd"/>
-      <w:r>
-        <w:t>create</w:t>
-      </w:r>
-      <w:proofErr w:type="spellEnd"/>
-      <w:r>
-        <w:t>($data);</w:t>
+        <w:t>$user = User::create($data);</w:t>
       </w:r>
     </w:p>
     <w:p>
@@ -2448,17 +2214,8 @@
           <w:b/>
           <w:bCs/>
         </w:rPr>
-        <w:t>Guarda el usuario creado en la variable $</w:t>
-      </w:r>
-      <w:proofErr w:type="spellStart"/>
-      <w:r>
-        <w:rPr>
-          <w:b/>
-          <w:bCs/>
-        </w:rPr>
-        <w:t>user</w:t>
-      </w:r>
-      <w:proofErr w:type="spellEnd"/>
+        <w:t>Guarda el usuario creado en la variable $user</w:t>
+      </w:r>
       <w:r>
         <w:br/>
       </w:r>
@@ -2517,7 +2274,7 @@
                     <pic:cNvPicPr/>
                   </pic:nvPicPr>
                   <pic:blipFill>
-                    <a:blip r:embed="rId30">
+                    <a:blip r:embed="rId32">
                       <a:extLst>
                         <a:ext uri="{28A0092B-C50C-407E-A947-70E740481C1C}">
                           <a14:useLocalDpi xmlns:a14="http://schemas.microsoft.com/office/drawing/2010/main" val="0"/>
@@ -2602,7 +2359,7 @@
                     <pic:cNvPicPr/>
                   </pic:nvPicPr>
                   <pic:blipFill>
-                    <a:blip r:embed="rId31">
+                    <a:blip r:embed="rId33">
                       <a:extLst>
                         <a:ext uri="{28A0092B-C50C-407E-A947-70E740481C1C}">
                           <a14:useLocalDpi xmlns:a14="http://schemas.microsoft.com/office/drawing/2010/main" val="0"/>
@@ -2682,45 +2439,9 @@
       <w:pPr>
         <w:ind w:firstLine="708"/>
       </w:pPr>
-      <w:proofErr w:type="spellStart"/>
-      <w:r>
-        <w:t>php</w:t>
-      </w:r>
-      <w:proofErr w:type="spellEnd"/>
-      <w:r>
-        <w:t xml:space="preserve"> </w:t>
-      </w:r>
-      <w:proofErr w:type="spellStart"/>
-      <w:r>
-        <w:t>artisan</w:t>
-      </w:r>
-      <w:proofErr w:type="spellEnd"/>
-      <w:r>
-        <w:t xml:space="preserve"> </w:t>
-      </w:r>
-      <w:proofErr w:type="spellStart"/>
-      <w:proofErr w:type="gramStart"/>
-      <w:r>
-        <w:t>make:controller</w:t>
-      </w:r>
-      <w:proofErr w:type="spellEnd"/>
-      <w:proofErr w:type="gramEnd"/>
-      <w:r>
-        <w:t xml:space="preserve"> </w:t>
-      </w:r>
-      <w:proofErr w:type="spellStart"/>
-      <w:r>
-        <w:t>Admin</w:t>
-      </w:r>
-      <w:proofErr w:type="spellEnd"/>
-      <w:r>
-        <w:t>\</w:t>
-      </w:r>
-      <w:proofErr w:type="spellStart"/>
-      <w:r>
-        <w:t>RoleController</w:t>
-      </w:r>
-      <w:proofErr w:type="spellEnd"/>
+      <w:r>
+        <w:t>php artisan make:controller Admin\RoleController</w:t>
+      </w:r>
     </w:p>
     <w:p>
       <w:pPr>
@@ -2754,7 +2475,7 @@
                     <pic:cNvPicPr/>
                   </pic:nvPicPr>
                   <pic:blipFill>
-                    <a:blip r:embed="rId32">
+                    <a:blip r:embed="rId34">
                       <a:extLst>
                         <a:ext uri="{28A0092B-C50C-407E-A947-70E740481C1C}">
                           <a14:useLocalDpi xmlns:a14="http://schemas.microsoft.com/office/drawing/2010/main" val="0"/>
@@ -2786,53 +2507,14 @@
           </wp:anchor>
         </w:drawing>
       </w:r>
-      <w:proofErr w:type="spellStart"/>
-      <w:r>
-        <w:t>php</w:t>
-      </w:r>
-      <w:proofErr w:type="spellEnd"/>
-      <w:r>
-        <w:t xml:space="preserve"> </w:t>
-      </w:r>
-      <w:proofErr w:type="spellStart"/>
-      <w:r>
-        <w:t>artisan</w:t>
-      </w:r>
-      <w:proofErr w:type="spellEnd"/>
-      <w:r>
-        <w:t xml:space="preserve"> </w:t>
-      </w:r>
-      <w:proofErr w:type="spellStart"/>
-      <w:proofErr w:type="gramStart"/>
-      <w:r>
-        <w:t>make:controller</w:t>
-      </w:r>
-      <w:proofErr w:type="spellEnd"/>
-      <w:proofErr w:type="gramEnd"/>
-      <w:r>
-        <w:t xml:space="preserve"> </w:t>
-      </w:r>
-      <w:proofErr w:type="spellStart"/>
-      <w:r>
-        <w:t>Admin</w:t>
-      </w:r>
-      <w:proofErr w:type="spellEnd"/>
-      <w:r>
-        <w:t>\</w:t>
-      </w:r>
-      <w:proofErr w:type="spellStart"/>
-      <w:r>
-        <w:t>Rol</w:t>
+      <w:r>
+        <w:t>php artisan make:controller Admin\Rol</w:t>
       </w:r>
       <w:r>
         <w:t>e</w:t>
       </w:r>
       <w:r>
-        <w:t>Controller</w:t>
-      </w:r>
-      <w:proofErr w:type="spellEnd"/>
-      <w:r>
-        <w:t xml:space="preserve"> -r</w:t>
+        <w:t>Controller -r</w:t>
       </w:r>
     </w:p>
     <w:p>
@@ -2867,7 +2549,7 @@
                     <pic:cNvPicPr/>
                   </pic:nvPicPr>
                   <pic:blipFill>
-                    <a:blip r:embed="rId33">
+                    <a:blip r:embed="rId35">
                       <a:extLst>
                         <a:ext uri="{28A0092B-C50C-407E-A947-70E740481C1C}">
                           <a14:useLocalDpi xmlns:a14="http://schemas.microsoft.com/office/drawing/2010/main" val="0"/>
@@ -2962,7 +2644,7 @@
                     <pic:cNvPicPr/>
                   </pic:nvPicPr>
                   <pic:blipFill>
-                    <a:blip r:embed="rId34">
+                    <a:blip r:embed="rId36">
                       <a:extLst>
                         <a:ext uri="{28A0092B-C50C-407E-A947-70E740481C1C}">
                           <a14:useLocalDpi xmlns:a14="http://schemas.microsoft.com/office/drawing/2010/main" val="0"/>
@@ -3022,7 +2704,7 @@
                     <pic:cNvPicPr/>
                   </pic:nvPicPr>
                   <pic:blipFill>
-                    <a:blip r:embed="rId35">
+                    <a:blip r:embed="rId37">
                       <a:extLst>
                         <a:ext uri="{28A0092B-C50C-407E-A947-70E740481C1C}">
                           <a14:useLocalDpi xmlns:a14="http://schemas.microsoft.com/office/drawing/2010/main" val="0"/>
@@ -3124,7 +2806,7 @@
                     <pic:cNvPicPr/>
                   </pic:nvPicPr>
                   <pic:blipFill>
-                    <a:blip r:embed="rId36">
+                    <a:blip r:embed="rId38">
                       <a:extLst>
                         <a:ext uri="{28A0092B-C50C-407E-A947-70E740481C1C}">
                           <a14:useLocalDpi xmlns:a14="http://schemas.microsoft.com/office/drawing/2010/main" val="0"/>
@@ -3184,7 +2866,7 @@
                     <pic:cNvPicPr/>
                   </pic:nvPicPr>
                   <pic:blipFill>
-                    <a:blip r:embed="rId37">
+                    <a:blip r:embed="rId39">
                       <a:extLst>
                         <a:ext uri="{28A0092B-C50C-407E-A947-70E740481C1C}">
                           <a14:useLocalDpi xmlns:a14="http://schemas.microsoft.com/office/drawing/2010/main" val="0"/>
@@ -3247,7 +2929,7 @@
                     <pic:cNvPicPr/>
                   </pic:nvPicPr>
                   <pic:blipFill>
-                    <a:blip r:embed="rId38">
+                    <a:blip r:embed="rId40">
                       <a:extLst>
                         <a:ext uri="{28A0092B-C50C-407E-A947-70E740481C1C}">
                           <a14:useLocalDpi xmlns:a14="http://schemas.microsoft.com/office/drawing/2010/main" val="0"/>
@@ -3293,45 +2975,12 @@
     <w:p/>
     <w:p/>
     <w:p>
-      <w:proofErr w:type="spellStart"/>
-      <w:r>
-        <w:t>php</w:t>
-      </w:r>
-      <w:proofErr w:type="spellEnd"/>
-      <w:r>
-        <w:t xml:space="preserve"> </w:t>
-      </w:r>
-      <w:proofErr w:type="spellStart"/>
-      <w:r>
-        <w:t>artisan</w:t>
-      </w:r>
-      <w:proofErr w:type="spellEnd"/>
-      <w:r>
-        <w:t xml:space="preserve"> </w:t>
-      </w:r>
-      <w:proofErr w:type="spellStart"/>
-      <w:proofErr w:type="gramStart"/>
-      <w:r>
-        <w:t>make:datatable</w:t>
-      </w:r>
-      <w:proofErr w:type="spellEnd"/>
-      <w:proofErr w:type="gramEnd"/>
-      <w:r>
-        <w:t xml:space="preserve"> </w:t>
-      </w:r>
-      <w:proofErr w:type="spellStart"/>
-      <w:r>
-        <w:t>RoleTable</w:t>
-      </w:r>
-      <w:proofErr w:type="spellEnd"/>
-      <w:r>
-        <w:t xml:space="preserve"> </w:t>
-      </w:r>
-      <w:proofErr w:type="spellStart"/>
+      <w:r>
+        <w:t xml:space="preserve">php artisan make:datatable RoleTable </w:t>
+      </w:r>
       <w:r>
         <w:t>User</w:t>
       </w:r>
-      <w:proofErr w:type="spellEnd"/>
     </w:p>
     <w:p/>
     <w:p>
@@ -3355,13 +3004,8 @@
       </w:pPr>
       <w:r>
         <w:lastRenderedPageBreak/>
-        <w:t xml:space="preserve">configuración del </w:t>
-      </w:r>
-      <w:proofErr w:type="spellStart"/>
-      <w:r>
-        <w:t>roletable</w:t>
-      </w:r>
-      <w:proofErr w:type="spellEnd"/>
+        <w:t>configuración del roletable</w:t>
+      </w:r>
     </w:p>
     <w:p>
       <w:pPr>
@@ -3395,7 +3039,7 @@
                     <pic:cNvPicPr/>
                   </pic:nvPicPr>
                   <pic:blipFill>
-                    <a:blip r:embed="rId39">
+                    <a:blip r:embed="rId41">
                       <a:extLst>
                         <a:ext uri="{28A0092B-C50C-407E-A947-70E740481C1C}">
                           <a14:useLocalDpi xmlns:a14="http://schemas.microsoft.com/office/drawing/2010/main" val="0"/>
@@ -3455,7 +3099,7 @@
                     <pic:cNvPicPr/>
                   </pic:nvPicPr>
                   <pic:blipFill>
-                    <a:blip r:embed="rId40">
+                    <a:blip r:embed="rId42">
                       <a:extLst>
                         <a:ext uri="{28A0092B-C50C-407E-A947-70E740481C1C}">
                           <a14:useLocalDpi xmlns:a14="http://schemas.microsoft.com/office/drawing/2010/main" val="0"/>
@@ -3497,15 +3141,7 @@
     <w:p/>
     <w:p>
       <w:r>
-        <w:t xml:space="preserve">Usar </w:t>
-      </w:r>
-      <w:proofErr w:type="spellStart"/>
-      <w:r>
-        <w:t>spatie</w:t>
-      </w:r>
-      <w:proofErr w:type="spellEnd"/>
-      <w:r>
-        <w:t xml:space="preserve"> para el modelo de roles</w:t>
+        <w:t>Usar spatie para el modelo de roles</w:t>
       </w:r>
     </w:p>
     <w:p>
@@ -3537,7 +3173,7 @@
                     <pic:cNvPicPr/>
                   </pic:nvPicPr>
                   <pic:blipFill>
-                    <a:blip r:embed="rId41">
+                    <a:blip r:embed="rId43">
                       <a:extLst>
                         <a:ext uri="{28A0092B-C50C-407E-A947-70E740481C1C}">
                           <a14:useLocalDpi xmlns:a14="http://schemas.microsoft.com/office/drawing/2010/main" val="0"/>
@@ -3591,94 +3227,17 @@
       </w:r>
     </w:p>
     <w:p>
-      <w:proofErr w:type="spellStart"/>
-      <w:r>
-        <w:t>php</w:t>
-      </w:r>
-      <w:proofErr w:type="spellEnd"/>
-      <w:r>
-        <w:t xml:space="preserve"> </w:t>
-      </w:r>
-      <w:proofErr w:type="spellStart"/>
-      <w:r>
-        <w:t>artisan</w:t>
-      </w:r>
-      <w:proofErr w:type="spellEnd"/>
-      <w:r>
-        <w:t xml:space="preserve"> </w:t>
-      </w:r>
-      <w:proofErr w:type="spellStart"/>
-      <w:proofErr w:type="gramStart"/>
-      <w:r>
-        <w:t>make:controller</w:t>
-      </w:r>
-      <w:proofErr w:type="spellEnd"/>
-      <w:proofErr w:type="gramEnd"/>
-      <w:r>
-        <w:t xml:space="preserve"> </w:t>
-      </w:r>
-      <w:proofErr w:type="spellStart"/>
-      <w:r>
-        <w:t>Admin</w:t>
-      </w:r>
-      <w:proofErr w:type="spellEnd"/>
-      <w:r>
-        <w:t>\</w:t>
-      </w:r>
-      <w:proofErr w:type="spellStart"/>
-      <w:r>
-        <w:t>PermissionController</w:t>
-      </w:r>
-      <w:proofErr w:type="spellEnd"/>
-      <w:r>
-        <w:t xml:space="preserve"> -r</w:t>
-      </w:r>
-    </w:p>
-    <w:p>
-      <w:proofErr w:type="spellStart"/>
-      <w:r>
-        <w:t>php</w:t>
-      </w:r>
-      <w:proofErr w:type="spellEnd"/>
-      <w:r>
-        <w:t xml:space="preserve"> </w:t>
-      </w:r>
-      <w:proofErr w:type="spellStart"/>
-      <w:r>
-        <w:t>artisan</w:t>
-      </w:r>
-      <w:proofErr w:type="spellEnd"/>
-      <w:r>
-        <w:t xml:space="preserve"> </w:t>
-      </w:r>
-      <w:proofErr w:type="spellStart"/>
-      <w:proofErr w:type="gramStart"/>
-      <w:r>
-        <w:t>make:datatable</w:t>
-      </w:r>
-      <w:proofErr w:type="spellEnd"/>
-      <w:proofErr w:type="gramEnd"/>
-      <w:r>
-        <w:t xml:space="preserve"> </w:t>
-      </w:r>
-      <w:proofErr w:type="spellStart"/>
-      <w:r>
-        <w:t>permission</w:t>
-      </w:r>
-      <w:proofErr w:type="spellEnd"/>
-      <w:r>
-        <w:t>-</w:t>
-      </w:r>
-      <w:proofErr w:type="gramStart"/>
-      <w:r>
-        <w:t xml:space="preserve">table  </w:t>
-      </w:r>
-      <w:proofErr w:type="spellStart"/>
+      <w:r>
+        <w:t>php artisan make:controller Admin\PermissionController -r</w:t>
+      </w:r>
+    </w:p>
+    <w:p>
+      <w:r>
+        <w:t xml:space="preserve">php artisan make:datatable permission-table  </w:t>
+      </w:r>
       <w:r>
         <w:t>User</w:t>
       </w:r>
-      <w:proofErr w:type="spellEnd"/>
-      <w:proofErr w:type="gramEnd"/>
     </w:p>
     <w:p/>
     <w:p>
@@ -3701,51 +3260,15 @@
       <w:r>
         <w:t xml:space="preserve">1. </w:t>
       </w:r>
-      <w:proofErr w:type="spellStart"/>
-      <w:r>
-        <w:t>php</w:t>
-      </w:r>
-      <w:proofErr w:type="spellEnd"/>
-      <w:r>
-        <w:t xml:space="preserve"> </w:t>
-      </w:r>
-      <w:proofErr w:type="spellStart"/>
-      <w:r>
-        <w:t>artisan</w:t>
-      </w:r>
-      <w:proofErr w:type="spellEnd"/>
-      <w:r>
-        <w:t xml:space="preserve"> </w:t>
-      </w:r>
-      <w:proofErr w:type="spellStart"/>
-      <w:proofErr w:type="gramStart"/>
-      <w:r>
-        <w:t>make:controller</w:t>
-      </w:r>
-      <w:proofErr w:type="spellEnd"/>
-      <w:proofErr w:type="gramEnd"/>
-      <w:r>
-        <w:t xml:space="preserve"> </w:t>
-      </w:r>
-      <w:proofErr w:type="spellStart"/>
-      <w:r>
-        <w:t>Admin</w:t>
-      </w:r>
-      <w:proofErr w:type="spellEnd"/>
-      <w:r>
-        <w:t>\</w:t>
-      </w:r>
-      <w:proofErr w:type="spellStart"/>
-      <w:r>
-        <w:t>PermissionController</w:t>
-      </w:r>
-      <w:proofErr w:type="spellEnd"/>
-      <w:r>
-        <w:t xml:space="preserve"> -r</w:t>
-      </w:r>
-    </w:p>
-    <w:p>
-      <w:r>
+      <w:r>
+        <w:t>php artisan make:controller Admin\PermissionController -r</w:t>
+      </w:r>
+    </w:p>
+    <w:p>
+      <w:r>
+        <w:rPr>
+          <w:noProof/>
+        </w:rPr>
         <w:drawing>
           <wp:anchor distT="0" distB="0" distL="114300" distR="114300" simplePos="0" relativeHeight="251693056" behindDoc="0" locked="0" layoutInCell="1" allowOverlap="1" wp14:anchorId="7AFDAFC2" wp14:editId="6152CCDA">
             <wp:simplePos x="0" y="0"/>
@@ -3770,7 +3293,7 @@
                     <pic:cNvPicPr/>
                   </pic:nvPicPr>
                   <pic:blipFill>
-                    <a:blip r:embed="rId42">
+                    <a:blip r:embed="rId44">
                       <a:extLst>
                         <a:ext uri="{28A0092B-C50C-407E-A947-70E740481C1C}">
                           <a14:useLocalDpi xmlns:a14="http://schemas.microsoft.com/office/drawing/2010/main" val="0"/>
@@ -3803,25 +3326,20 @@
         </w:drawing>
       </w:r>
       <w:r>
-        <w:t xml:space="preserve">Y acá definir los </w:t>
-      </w:r>
-      <w:proofErr w:type="spellStart"/>
-      <w:r>
-        <w:t>view</w:t>
-      </w:r>
-      <w:proofErr w:type="spellEnd"/>
-      <w:r>
-        <w:t xml:space="preserve"> en cada método</w:t>
-      </w:r>
-    </w:p>
-    <w:p/>
-    <w:p/>
-    <w:p/>
-    <w:p/>
-    <w:p/>
-    <w:p/>
-    <w:p>
-      <w:r>
+        <w:t>Y acá definir los view en cada método</w:t>
+      </w:r>
+    </w:p>
+    <w:p/>
+    <w:p/>
+    <w:p/>
+    <w:p/>
+    <w:p/>
+    <w:p/>
+    <w:p>
+      <w:r>
+        <w:rPr>
+          <w:noProof/>
+        </w:rPr>
         <w:lastRenderedPageBreak/>
         <w:drawing>
           <wp:anchor distT="0" distB="0" distL="114300" distR="114300" simplePos="0" relativeHeight="251694080" behindDoc="0" locked="0" layoutInCell="1" allowOverlap="1" wp14:anchorId="521310D4" wp14:editId="1413D5B6">
@@ -3847,7 +3365,7 @@
                     <pic:cNvPicPr/>
                   </pic:nvPicPr>
                   <pic:blipFill>
-                    <a:blip r:embed="rId43">
+                    <a:blip r:embed="rId45">
                       <a:extLst>
                         <a:ext uri="{28A0092B-C50C-407E-A947-70E740481C1C}">
                           <a14:useLocalDpi xmlns:a14="http://schemas.microsoft.com/office/drawing/2010/main" val="0"/>
@@ -3880,31 +3398,7 @@
         </w:drawing>
       </w:r>
       <w:r>
-        <w:t xml:space="preserve">2. en </w:t>
-      </w:r>
-      <w:proofErr w:type="spellStart"/>
-      <w:r>
-        <w:t>views</w:t>
-      </w:r>
-      <w:proofErr w:type="spellEnd"/>
-      <w:r>
-        <w:t>/</w:t>
-      </w:r>
-      <w:proofErr w:type="spellStart"/>
-      <w:r>
-        <w:t>admin</w:t>
-      </w:r>
-      <w:proofErr w:type="spellEnd"/>
-      <w:r>
-        <w:t>/</w:t>
-      </w:r>
-      <w:proofErr w:type="spellStart"/>
-      <w:r>
-        <w:t>permissions</w:t>
-      </w:r>
-      <w:proofErr w:type="spellEnd"/>
-      <w:r>
-        <w:t xml:space="preserve"> y allí definir esto</w:t>
+        <w:t>2. en views/admin/permissions y allí definir esto</w:t>
       </w:r>
     </w:p>
     <w:p>
@@ -3923,19 +3417,14 @@
           <w:bCs/>
         </w:rPr>
         <w:tab/>
-      </w:r>
-      <w:proofErr w:type="spellStart"/>
-      <w:r>
-        <w:rPr>
-          <w:b/>
-          <w:bCs/>
-        </w:rPr>
         <w:t>create.blade.php</w:t>
       </w:r>
-      <w:proofErr w:type="spellEnd"/>
-    </w:p>
-    <w:p>
-      <w:r>
+    </w:p>
+    <w:p>
+      <w:r>
+        <w:rPr>
+          <w:noProof/>
+        </w:rPr>
         <w:drawing>
           <wp:anchor distT="0" distB="0" distL="114300" distR="114300" simplePos="0" relativeHeight="251695104" behindDoc="0" locked="0" layoutInCell="1" allowOverlap="1" wp14:anchorId="0536481E" wp14:editId="4D87E2A3">
             <wp:simplePos x="0" y="0"/>
@@ -3960,7 +3449,7 @@
                     <pic:cNvPicPr/>
                   </pic:nvPicPr>
                   <pic:blipFill>
-                    <a:blip r:embed="rId44">
+                    <a:blip r:embed="rId46">
                       <a:extLst>
                         <a:ext uri="{28A0092B-C50C-407E-A947-70E740481C1C}">
                           <a14:useLocalDpi xmlns:a14="http://schemas.microsoft.com/office/drawing/2010/main" val="0"/>
@@ -4006,7 +3495,6 @@
           <w:bCs/>
         </w:rPr>
       </w:pPr>
-      <w:proofErr w:type="spellStart"/>
       <w:r>
         <w:rPr>
           <w:b/>
@@ -4014,10 +3502,12 @@
         </w:rPr>
         <w:t>Edit.blade.php</w:t>
       </w:r>
-      <w:proofErr w:type="spellEnd"/>
-    </w:p>
-    <w:p>
-      <w:r>
+    </w:p>
+    <w:p>
+      <w:r>
+        <w:rPr>
+          <w:noProof/>
+        </w:rPr>
         <w:drawing>
           <wp:anchor distT="0" distB="0" distL="114300" distR="114300" simplePos="0" relativeHeight="251696128" behindDoc="0" locked="0" layoutInCell="1" allowOverlap="1" wp14:anchorId="1515B197" wp14:editId="65B81F02">
             <wp:simplePos x="0" y="0"/>
@@ -4042,7 +3532,7 @@
                     <pic:cNvPicPr/>
                   </pic:nvPicPr>
                   <pic:blipFill>
-                    <a:blip r:embed="rId45">
+                    <a:blip r:embed="rId47">
                       <a:extLst>
                         <a:ext uri="{28A0092B-C50C-407E-A947-70E740481C1C}">
                           <a14:useLocalDpi xmlns:a14="http://schemas.microsoft.com/office/drawing/2010/main" val="0"/>
@@ -4090,6 +3580,7 @@
         <w:rPr>
           <w:b/>
           <w:bCs/>
+          <w:noProof/>
         </w:rPr>
         <w:drawing>
           <wp:anchor distT="0" distB="0" distL="114300" distR="114300" simplePos="0" relativeHeight="251697152" behindDoc="0" locked="0" layoutInCell="1" allowOverlap="1" wp14:anchorId="669E3344" wp14:editId="35B6AC8A">
@@ -4115,7 +3606,7 @@
                     <pic:cNvPicPr/>
                   </pic:nvPicPr>
                   <pic:blipFill>
-                    <a:blip r:embed="rId46">
+                    <a:blip r:embed="rId48">
                       <a:extLst>
                         <a:ext uri="{28A0092B-C50C-407E-A947-70E740481C1C}">
                           <a14:useLocalDpi xmlns:a14="http://schemas.microsoft.com/office/drawing/2010/main" val="0"/>
@@ -4153,16 +3644,8 @@
           <w:bCs/>
         </w:rPr>
         <w:tab/>
-      </w:r>
-      <w:proofErr w:type="spellStart"/>
-      <w:r>
-        <w:rPr>
-          <w:b/>
-          <w:bCs/>
-        </w:rPr>
         <w:t>Index.blade.php</w:t>
       </w:r>
-      <w:proofErr w:type="spellEnd"/>
     </w:p>
     <w:p>
       <w:pPr>
@@ -4184,61 +3667,12 @@
     <w:p/>
     <w:p>
       <w:r>
-        <w:t xml:space="preserve">3. definir ruta en </w:t>
-      </w:r>
-      <w:proofErr w:type="spellStart"/>
-      <w:r>
-        <w:t>admin</w:t>
-      </w:r>
-      <w:proofErr w:type="spellEnd"/>
-    </w:p>
-    <w:p>
-      <w:proofErr w:type="spellStart"/>
-      <w:proofErr w:type="gramStart"/>
-      <w:r>
-        <w:t>Route</w:t>
-      </w:r>
-      <w:proofErr w:type="spellEnd"/>
-      <w:r>
-        <w:t>::</w:t>
-      </w:r>
-      <w:proofErr w:type="spellStart"/>
-      <w:r>
-        <w:t>resource</w:t>
-      </w:r>
-      <w:proofErr w:type="spellEnd"/>
-      <w:r>
-        <w:t>(</w:t>
-      </w:r>
-      <w:proofErr w:type="gramEnd"/>
-      <w:r>
-        <w:t>'</w:t>
-      </w:r>
-      <w:proofErr w:type="spellStart"/>
-      <w:r>
-        <w:t>permissions</w:t>
-      </w:r>
-      <w:proofErr w:type="spellEnd"/>
-      <w:r>
-        <w:t xml:space="preserve">', </w:t>
-      </w:r>
-      <w:proofErr w:type="spellStart"/>
-      <w:proofErr w:type="gramStart"/>
-      <w:r>
-        <w:t>PermissionController</w:t>
-      </w:r>
-      <w:proofErr w:type="spellEnd"/>
-      <w:r>
-        <w:t>::</w:t>
-      </w:r>
-      <w:proofErr w:type="spellStart"/>
-      <w:proofErr w:type="gramEnd"/>
-      <w:r>
-        <w:t>class</w:t>
-      </w:r>
-      <w:proofErr w:type="spellEnd"/>
-      <w:r>
-        <w:t>);</w:t>
+        <w:t>3. definir ruta en admin</w:t>
+      </w:r>
+    </w:p>
+    <w:p>
+      <w:r>
+        <w:t>Route::resource('permissions', PermissionController::class);</w:t>
       </w:r>
     </w:p>
     <w:p/>
@@ -4246,63 +3680,23 @@
     <w:p>
       <w:r>
         <w:lastRenderedPageBreak/>
-        <w:t xml:space="preserve">4. crear en </w:t>
-      </w:r>
-      <w:proofErr w:type="spellStart"/>
-      <w:r>
-        <w:t>datatable</w:t>
-      </w:r>
-      <w:proofErr w:type="spellEnd"/>
-    </w:p>
-    <w:p>
-      <w:proofErr w:type="spellStart"/>
-      <w:r>
-        <w:t>php</w:t>
-      </w:r>
-      <w:proofErr w:type="spellEnd"/>
-      <w:r>
-        <w:t xml:space="preserve"> </w:t>
-      </w:r>
-      <w:proofErr w:type="spellStart"/>
-      <w:r>
-        <w:t>artisan</w:t>
-      </w:r>
-      <w:proofErr w:type="spellEnd"/>
-      <w:r>
-        <w:t xml:space="preserve"> </w:t>
-      </w:r>
-      <w:proofErr w:type="spellStart"/>
-      <w:proofErr w:type="gramStart"/>
-      <w:r>
-        <w:t>make:datatable</w:t>
-      </w:r>
-      <w:proofErr w:type="spellEnd"/>
-      <w:proofErr w:type="gramEnd"/>
-      <w:r>
-        <w:t xml:space="preserve"> </w:t>
-      </w:r>
-      <w:proofErr w:type="spellStart"/>
-      <w:r>
-        <w:t>permission</w:t>
-      </w:r>
-      <w:proofErr w:type="spellEnd"/>
-      <w:r>
-        <w:t>-</w:t>
-      </w:r>
-      <w:proofErr w:type="gramStart"/>
-      <w:r>
-        <w:t xml:space="preserve">table  </w:t>
-      </w:r>
-      <w:proofErr w:type="spellStart"/>
+        <w:t>4. crear en datatable</w:t>
+      </w:r>
+    </w:p>
+    <w:p>
+      <w:r>
+        <w:t xml:space="preserve">php artisan make:datatable permission-table  </w:t>
+      </w:r>
       <w:r>
         <w:t>User</w:t>
       </w:r>
-      <w:proofErr w:type="spellEnd"/>
-      <w:proofErr w:type="gramEnd"/>
-    </w:p>
-    <w:p/>
-    <w:p>
-      <w:r>
+    </w:p>
+    <w:p/>
+    <w:p>
+      <w:r>
+        <w:rPr>
+          <w:noProof/>
+        </w:rPr>
         <w:drawing>
           <wp:anchor distT="0" distB="0" distL="114300" distR="114300" simplePos="0" relativeHeight="251698176" behindDoc="0" locked="0" layoutInCell="1" allowOverlap="1" wp14:anchorId="7C50DDB6" wp14:editId="36FC78A0">
             <wp:simplePos x="0" y="0"/>
@@ -4327,7 +3721,7 @@
                     <pic:cNvPicPr/>
                   </pic:nvPicPr>
                   <pic:blipFill>
-                    <a:blip r:embed="rId47">
+                    <a:blip r:embed="rId49">
                       <a:extLst>
                         <a:ext uri="{28A0092B-C50C-407E-A947-70E740481C1C}">
                           <a14:useLocalDpi xmlns:a14="http://schemas.microsoft.com/office/drawing/2010/main" val="0"/>
@@ -4363,30 +3757,25 @@
         <w:t xml:space="preserve">5. </w:t>
       </w:r>
       <w:r>
-        <w:t xml:space="preserve">edición de </w:t>
-      </w:r>
-      <w:proofErr w:type="spellStart"/>
-      <w:r>
-        <w:t>permission</w:t>
-      </w:r>
-      <w:proofErr w:type="spellEnd"/>
-      <w:r>
-        <w:t xml:space="preserve"> table</w:t>
-      </w:r>
-    </w:p>
-    <w:p/>
-    <w:p/>
-    <w:p/>
-    <w:p/>
-    <w:p/>
-    <w:p/>
-    <w:p/>
-    <w:p/>
-    <w:p/>
-    <w:p/>
-    <w:p/>
-    <w:p>
-      <w:r>
+        <w:t>edición de permission table</w:t>
+      </w:r>
+    </w:p>
+    <w:p/>
+    <w:p/>
+    <w:p/>
+    <w:p/>
+    <w:p/>
+    <w:p/>
+    <w:p/>
+    <w:p/>
+    <w:p/>
+    <w:p/>
+    <w:p/>
+    <w:p>
+      <w:r>
+        <w:rPr>
+          <w:noProof/>
+        </w:rPr>
         <w:drawing>
           <wp:anchor distT="0" distB="0" distL="114300" distR="114300" simplePos="0" relativeHeight="251699200" behindDoc="0" locked="0" layoutInCell="1" allowOverlap="1" wp14:anchorId="599A6592" wp14:editId="0D08AFE0">
             <wp:simplePos x="0" y="0"/>
@@ -4411,7 +3800,7 @@
                     <pic:cNvPicPr/>
                   </pic:nvPicPr>
                   <pic:blipFill>
-                    <a:blip r:embed="rId48">
+                    <a:blip r:embed="rId50">
                       <a:extLst>
                         <a:ext uri="{28A0092B-C50C-407E-A947-70E740481C1C}">
                           <a14:useLocalDpi xmlns:a14="http://schemas.microsoft.com/office/drawing/2010/main" val="0"/>
@@ -4444,16 +3833,14 @@
         </w:drawing>
       </w:r>
       <w:r>
-        <w:t xml:space="preserve">6. mandarlo a llamar en el </w:t>
-      </w:r>
-      <w:proofErr w:type="spellStart"/>
-      <w:r>
-        <w:t>index</w:t>
-      </w:r>
-      <w:proofErr w:type="spellEnd"/>
-    </w:p>
-    <w:p>
-      <w:r>
+        <w:t>6. mandarlo a llamar en el index</w:t>
+      </w:r>
+    </w:p>
+    <w:p>
+      <w:r>
+        <w:rPr>
+          <w:noProof/>
+        </w:rPr>
         <w:drawing>
           <wp:anchor distT="0" distB="0" distL="114300" distR="114300" simplePos="0" relativeHeight="251700224" behindDoc="0" locked="0" layoutInCell="1" allowOverlap="1" wp14:anchorId="5A6AEB0C" wp14:editId="06454077">
             <wp:simplePos x="0" y="0"/>
@@ -4478,7 +3865,7 @@
                     <pic:cNvPicPr/>
                   </pic:nvPicPr>
                   <pic:blipFill>
-                    <a:blip r:embed="rId49">
+                    <a:blip r:embed="rId51">
                       <a:extLst>
                         <a:ext uri="{28A0092B-C50C-407E-A947-70E740481C1C}">
                           <a14:useLocalDpi xmlns:a14="http://schemas.microsoft.com/office/drawing/2010/main" val="0"/>
@@ -4511,6 +3898,448 @@
         </w:drawing>
       </w:r>
     </w:p>
+    <w:p/>
+    <w:p/>
+    <w:p/>
+    <w:p/>
+    <w:p/>
+    <w:p/>
+    <w:p>
+      <w:pPr>
+        <w:rPr>
+          <w:b/>
+          <w:bCs/>
+        </w:rPr>
+      </w:pPr>
+      <w:r>
+        <w:rPr>
+          <w:b/>
+          <w:bCs/>
+        </w:rPr>
+        <w:drawing>
+          <wp:anchor distT="0" distB="0" distL="114300" distR="114300" simplePos="0" relativeHeight="251701248" behindDoc="0" locked="0" layoutInCell="1" allowOverlap="1" wp14:anchorId="31F1C5F7" wp14:editId="674E4D5D">
+            <wp:simplePos x="0" y="0"/>
+            <wp:positionH relativeFrom="margin">
+              <wp:posOffset>-267419</wp:posOffset>
+            </wp:positionH>
+            <wp:positionV relativeFrom="paragraph">
+              <wp:posOffset>345500</wp:posOffset>
+            </wp:positionV>
+            <wp:extent cx="6605165" cy="1302589"/>
+            <wp:effectExtent l="0" t="0" r="5715" b="0"/>
+            <wp:wrapNone/>
+            <wp:docPr id="1" name="Imagen 1"/>
+            <wp:cNvGraphicFramePr>
+              <a:graphicFrameLocks xmlns:a="http://schemas.openxmlformats.org/drawingml/2006/main" noChangeAspect="1"/>
+            </wp:cNvGraphicFramePr>
+            <a:graphic xmlns:a="http://schemas.openxmlformats.org/drawingml/2006/main">
+              <a:graphicData uri="http://schemas.openxmlformats.org/drawingml/2006/picture">
+                <pic:pic xmlns:pic="http://schemas.openxmlformats.org/drawingml/2006/picture">
+                  <pic:nvPicPr>
+                    <pic:cNvPr id="1" name=""/>
+                    <pic:cNvPicPr/>
+                  </pic:nvPicPr>
+                  <pic:blipFill>
+                    <a:blip r:embed="rId52">
+                      <a:extLst>
+                        <a:ext uri="{28A0092B-C50C-407E-A947-70E740481C1C}">
+                          <a14:useLocalDpi xmlns:a14="http://schemas.microsoft.com/office/drawing/2010/main" val="0"/>
+                        </a:ext>
+                      </a:extLst>
+                    </a:blip>
+                    <a:stretch>
+                      <a:fillRect/>
+                    </a:stretch>
+                  </pic:blipFill>
+                  <pic:spPr>
+                    <a:xfrm>
+                      <a:off x="0" y="0"/>
+                      <a:ext cx="6605165" cy="1302589"/>
+                    </a:xfrm>
+                    <a:prstGeom prst="rect">
+                      <a:avLst/>
+                    </a:prstGeom>
+                  </pic:spPr>
+                </pic:pic>
+              </a:graphicData>
+            </a:graphic>
+            <wp14:sizeRelH relativeFrom="page">
+              <wp14:pctWidth>0</wp14:pctWidth>
+            </wp14:sizeRelH>
+            <wp14:sizeRelV relativeFrom="page">
+              <wp14:pctHeight>0</wp14:pctHeight>
+            </wp14:sizeRelV>
+          </wp:anchor>
+        </w:drawing>
+      </w:r>
+      <w:r>
+        <w:rPr>
+          <w:b/>
+          <w:bCs/>
+        </w:rPr>
+        <w:t>Proteger rutas de instructor y solo cuando sea instructor deje acceder</w:t>
+      </w:r>
+    </w:p>
+    <w:p/>
+    <w:p/>
+    <w:p/>
+    <w:p/>
+    <w:p/>
+    <w:p>
+      <w:r>
+        <w:lastRenderedPageBreak/>
+        <w:drawing>
+          <wp:anchor distT="0" distB="0" distL="114300" distR="114300" simplePos="0" relativeHeight="251702272" behindDoc="0" locked="0" layoutInCell="1" allowOverlap="1" wp14:anchorId="25A99DC9" wp14:editId="6A61786F">
+            <wp:simplePos x="0" y="0"/>
+            <wp:positionH relativeFrom="margin">
+              <wp:align>left</wp:align>
+            </wp:positionH>
+            <wp:positionV relativeFrom="paragraph">
+              <wp:posOffset>66471</wp:posOffset>
+            </wp:positionV>
+            <wp:extent cx="6003985" cy="5093408"/>
+            <wp:effectExtent l="0" t="0" r="0" b="0"/>
+            <wp:wrapNone/>
+            <wp:docPr id="2" name="Imagen 2"/>
+            <wp:cNvGraphicFramePr>
+              <a:graphicFrameLocks xmlns:a="http://schemas.openxmlformats.org/drawingml/2006/main" noChangeAspect="1"/>
+            </wp:cNvGraphicFramePr>
+            <a:graphic xmlns:a="http://schemas.openxmlformats.org/drawingml/2006/main">
+              <a:graphicData uri="http://schemas.openxmlformats.org/drawingml/2006/picture">
+                <pic:pic xmlns:pic="http://schemas.openxmlformats.org/drawingml/2006/picture">
+                  <pic:nvPicPr>
+                    <pic:cNvPr id="1" name=""/>
+                    <pic:cNvPicPr/>
+                  </pic:nvPicPr>
+                  <pic:blipFill>
+                    <a:blip r:embed="rId53">
+                      <a:extLst>
+                        <a:ext uri="{28A0092B-C50C-407E-A947-70E740481C1C}">
+                          <a14:useLocalDpi xmlns:a14="http://schemas.microsoft.com/office/drawing/2010/main" val="0"/>
+                        </a:ext>
+                      </a:extLst>
+                    </a:blip>
+                    <a:stretch>
+                      <a:fillRect/>
+                    </a:stretch>
+                  </pic:blipFill>
+                  <pic:spPr>
+                    <a:xfrm>
+                      <a:off x="0" y="0"/>
+                      <a:ext cx="6003985" cy="5093408"/>
+                    </a:xfrm>
+                    <a:prstGeom prst="rect">
+                      <a:avLst/>
+                    </a:prstGeom>
+                  </pic:spPr>
+                </pic:pic>
+              </a:graphicData>
+            </a:graphic>
+            <wp14:sizeRelH relativeFrom="page">
+              <wp14:pctWidth>0</wp14:pctWidth>
+            </wp14:sizeRelH>
+            <wp14:sizeRelV relativeFrom="page">
+              <wp14:pctHeight>0</wp14:pctHeight>
+            </wp14:sizeRelV>
+          </wp:anchor>
+        </w:drawing>
+      </w:r>
+    </w:p>
+    <w:p/>
+    <w:p/>
+    <w:p/>
+    <w:p/>
+    <w:p/>
+    <w:p/>
+    <w:p/>
+    <w:p/>
+    <w:p/>
+    <w:p/>
+    <w:p/>
+    <w:p/>
+    <w:p/>
+    <w:p/>
+    <w:p/>
+    <w:p/>
+    <w:p/>
+    <w:p/>
+    <w:p>
+      <w:pPr>
+        <w:tabs>
+          <w:tab w:val="left" w:pos="3220"/>
+        </w:tabs>
+      </w:pPr>
+      <w:r>
+        <w:tab/>
+      </w:r>
+    </w:p>
+    <w:p>
+      <w:pPr>
+        <w:tabs>
+          <w:tab w:val="left" w:pos="3220"/>
+        </w:tabs>
+        <w:jc w:val="center"/>
+        <w:rPr>
+          <w:b/>
+          <w:bCs/>
+        </w:rPr>
+      </w:pPr>
+      <w:r>
+        <w:rPr>
+          <w:b/>
+          <w:bCs/>
+        </w:rPr>
+        <w:t>Modificar el navigation-menu</w:t>
+      </w:r>
+    </w:p>
+    <w:p>
+      <w:pPr>
+        <w:tabs>
+          <w:tab w:val="left" w:pos="3220"/>
+        </w:tabs>
+      </w:pPr>
+      <w:r>
+        <w:drawing>
+          <wp:anchor distT="0" distB="0" distL="114300" distR="114300" simplePos="0" relativeHeight="251703296" behindDoc="0" locked="0" layoutInCell="1" allowOverlap="1" wp14:anchorId="52808521" wp14:editId="33178990">
+            <wp:simplePos x="0" y="0"/>
+            <wp:positionH relativeFrom="margin">
+              <wp:posOffset>-577838</wp:posOffset>
+            </wp:positionH>
+            <wp:positionV relativeFrom="paragraph">
+              <wp:posOffset>227067</wp:posOffset>
+            </wp:positionV>
+            <wp:extent cx="2232085" cy="1785668"/>
+            <wp:effectExtent l="0" t="0" r="0" b="5080"/>
+            <wp:wrapNone/>
+            <wp:docPr id="3" name="Imagen 3"/>
+            <wp:cNvGraphicFramePr>
+              <a:graphicFrameLocks xmlns:a="http://schemas.openxmlformats.org/drawingml/2006/main" noChangeAspect="1"/>
+            </wp:cNvGraphicFramePr>
+            <a:graphic xmlns:a="http://schemas.openxmlformats.org/drawingml/2006/main">
+              <a:graphicData uri="http://schemas.openxmlformats.org/drawingml/2006/picture">
+                <pic:pic xmlns:pic="http://schemas.openxmlformats.org/drawingml/2006/picture">
+                  <pic:nvPicPr>
+                    <pic:cNvPr id="1" name=""/>
+                    <pic:cNvPicPr/>
+                  </pic:nvPicPr>
+                  <pic:blipFill>
+                    <a:blip r:embed="rId54">
+                      <a:extLst>
+                        <a:ext uri="{28A0092B-C50C-407E-A947-70E740481C1C}">
+                          <a14:useLocalDpi xmlns:a14="http://schemas.microsoft.com/office/drawing/2010/main" val="0"/>
+                        </a:ext>
+                      </a:extLst>
+                    </a:blip>
+                    <a:stretch>
+                      <a:fillRect/>
+                    </a:stretch>
+                  </pic:blipFill>
+                  <pic:spPr>
+                    <a:xfrm>
+                      <a:off x="0" y="0"/>
+                      <a:ext cx="2232085" cy="1785668"/>
+                    </a:xfrm>
+                    <a:prstGeom prst="rect">
+                      <a:avLst/>
+                    </a:prstGeom>
+                  </pic:spPr>
+                </pic:pic>
+              </a:graphicData>
+            </a:graphic>
+            <wp14:sizeRelH relativeFrom="page">
+              <wp14:pctWidth>0</wp14:pctWidth>
+            </wp14:sizeRelH>
+            <wp14:sizeRelV relativeFrom="page">
+              <wp14:pctHeight>0</wp14:pctHeight>
+            </wp14:sizeRelV>
+          </wp:anchor>
+        </w:drawing>
+      </w:r>
+      <w:r>
+        <w:t>resources/view/navigation-menu</w:t>
+      </w:r>
+    </w:p>
+    <w:p>
+      <w:pPr>
+        <w:tabs>
+          <w:tab w:val="left" w:pos="3220"/>
+        </w:tabs>
+      </w:pPr>
+      <w:r>
+        <w:drawing>
+          <wp:anchor distT="0" distB="0" distL="114300" distR="114300" simplePos="0" relativeHeight="251704320" behindDoc="0" locked="0" layoutInCell="1" allowOverlap="1" wp14:anchorId="3EE37852" wp14:editId="65DB807D">
+            <wp:simplePos x="0" y="0"/>
+            <wp:positionH relativeFrom="page">
+              <wp:posOffset>2932909</wp:posOffset>
+            </wp:positionH>
+            <wp:positionV relativeFrom="paragraph">
+              <wp:posOffset>217194</wp:posOffset>
+            </wp:positionV>
+            <wp:extent cx="4545911" cy="1104181"/>
+            <wp:effectExtent l="0" t="0" r="7620" b="1270"/>
+            <wp:wrapNone/>
+            <wp:docPr id="4" name="Imagen 4"/>
+            <wp:cNvGraphicFramePr>
+              <a:graphicFrameLocks xmlns:a="http://schemas.openxmlformats.org/drawingml/2006/main" noChangeAspect="1"/>
+            </wp:cNvGraphicFramePr>
+            <a:graphic xmlns:a="http://schemas.openxmlformats.org/drawingml/2006/main">
+              <a:graphicData uri="http://schemas.openxmlformats.org/drawingml/2006/picture">
+                <pic:pic xmlns:pic="http://schemas.openxmlformats.org/drawingml/2006/picture">
+                  <pic:nvPicPr>
+                    <pic:cNvPr id="1" name=""/>
+                    <pic:cNvPicPr/>
+                  </pic:nvPicPr>
+                  <pic:blipFill>
+                    <a:blip r:embed="rId55">
+                      <a:extLst>
+                        <a:ext uri="{28A0092B-C50C-407E-A947-70E740481C1C}">
+                          <a14:useLocalDpi xmlns:a14="http://schemas.microsoft.com/office/drawing/2010/main" val="0"/>
+                        </a:ext>
+                      </a:extLst>
+                    </a:blip>
+                    <a:stretch>
+                      <a:fillRect/>
+                    </a:stretch>
+                  </pic:blipFill>
+                  <pic:spPr>
+                    <a:xfrm>
+                      <a:off x="0" y="0"/>
+                      <a:ext cx="4545911" cy="1104181"/>
+                    </a:xfrm>
+                    <a:prstGeom prst="rect">
+                      <a:avLst/>
+                    </a:prstGeom>
+                  </pic:spPr>
+                </pic:pic>
+              </a:graphicData>
+            </a:graphic>
+            <wp14:sizeRelH relativeFrom="page">
+              <wp14:pctWidth>0</wp14:pctWidth>
+            </wp14:sizeRelH>
+            <wp14:sizeRelV relativeFrom="page">
+              <wp14:pctHeight>0</wp14:pctHeight>
+            </wp14:sizeRelV>
+          </wp:anchor>
+        </w:drawing>
+      </w:r>
+    </w:p>
+    <w:p>
+      <w:pPr>
+        <w:tabs>
+          <w:tab w:val="left" w:pos="3220"/>
+        </w:tabs>
+      </w:pPr>
+    </w:p>
+    <w:p>
+      <w:pPr>
+        <w:tabs>
+          <w:tab w:val="left" w:pos="3220"/>
+        </w:tabs>
+      </w:pPr>
+    </w:p>
+    <w:p>
+      <w:pPr>
+        <w:tabs>
+          <w:tab w:val="left" w:pos="3220"/>
+        </w:tabs>
+      </w:pPr>
+    </w:p>
+    <w:p>
+      <w:pPr>
+        <w:tabs>
+          <w:tab w:val="left" w:pos="3220"/>
+        </w:tabs>
+      </w:pPr>
+    </w:p>
+    <w:p>
+      <w:pPr>
+        <w:tabs>
+          <w:tab w:val="left" w:pos="3220"/>
+        </w:tabs>
+      </w:pPr>
+    </w:p>
+    <w:p>
+      <w:pPr>
+        <w:tabs>
+          <w:tab w:val="left" w:pos="3220"/>
+        </w:tabs>
+      </w:pPr>
+    </w:p>
+    <w:p>
+      <w:pPr>
+        <w:tabs>
+          <w:tab w:val="left" w:pos="3220"/>
+        </w:tabs>
+      </w:pPr>
+      <w:r>
+        <w:lastRenderedPageBreak/>
+        <w:drawing>
+          <wp:anchor distT="0" distB="0" distL="114300" distR="114300" simplePos="0" relativeHeight="251705344" behindDoc="1" locked="0" layoutInCell="1" allowOverlap="1" wp14:anchorId="7E050ACA" wp14:editId="7C5E2413">
+            <wp:simplePos x="0" y="0"/>
+            <wp:positionH relativeFrom="column">
+              <wp:posOffset>-1833</wp:posOffset>
+            </wp:positionH>
+            <wp:positionV relativeFrom="paragraph">
+              <wp:posOffset>-2648</wp:posOffset>
+            </wp:positionV>
+            <wp:extent cx="2000529" cy="1943371"/>
+            <wp:effectExtent l="0" t="0" r="0" b="0"/>
+            <wp:wrapNone/>
+            <wp:docPr id="5" name="Imagen 5"/>
+            <wp:cNvGraphicFramePr>
+              <a:graphicFrameLocks xmlns:a="http://schemas.openxmlformats.org/drawingml/2006/main" noChangeAspect="1"/>
+            </wp:cNvGraphicFramePr>
+            <a:graphic xmlns:a="http://schemas.openxmlformats.org/drawingml/2006/main">
+              <a:graphicData uri="http://schemas.openxmlformats.org/drawingml/2006/picture">
+                <pic:pic xmlns:pic="http://schemas.openxmlformats.org/drawingml/2006/picture">
+                  <pic:nvPicPr>
+                    <pic:cNvPr id="1" name=""/>
+                    <pic:cNvPicPr/>
+                  </pic:nvPicPr>
+                  <pic:blipFill>
+                    <a:blip r:embed="rId56">
+                      <a:extLst>
+                        <a:ext uri="{28A0092B-C50C-407E-A947-70E740481C1C}">
+                          <a14:useLocalDpi xmlns:a14="http://schemas.microsoft.com/office/drawing/2010/main" val="0"/>
+                        </a:ext>
+                      </a:extLst>
+                    </a:blip>
+                    <a:stretch>
+                      <a:fillRect/>
+                    </a:stretch>
+                  </pic:blipFill>
+                  <pic:spPr>
+                    <a:xfrm>
+                      <a:off x="0" y="0"/>
+                      <a:ext cx="2000529" cy="1943371"/>
+                    </a:xfrm>
+                    <a:prstGeom prst="rect">
+                      <a:avLst/>
+                    </a:prstGeom>
+                  </pic:spPr>
+                </pic:pic>
+              </a:graphicData>
+            </a:graphic>
+            <wp14:sizeRelH relativeFrom="page">
+              <wp14:pctWidth>0</wp14:pctWidth>
+            </wp14:sizeRelH>
+            <wp14:sizeRelV relativeFrom="page">
+              <wp14:pctHeight>0</wp14:pctHeight>
+            </wp14:sizeRelV>
+          </wp:anchor>
+        </w:drawing>
+      </w:r>
+    </w:p>
+    <w:p/>
+    <w:p>
+      <w:pPr>
+        <w:ind w:firstLine="708"/>
+        <w:jc w:val="center"/>
+      </w:pPr>
+      <w:r>
+        <w:t>Solo aparecen estas funciones</w:t>
+      </w:r>
+    </w:p>
     <w:sectPr>
       <w:pgSz w:w="12240" w:h="15840"/>
       <w:pgMar w:top="1417" w:right="1701" w:bottom="1417" w:left="1701" w:header="708" w:footer="708" w:gutter="0"/>
@@ -4521,8 +4350,58 @@
 </w:document>
 </file>
 
+<file path=word/endnotes.xml><?xml version="1.0" encoding="utf-8"?>
+<w:endnotes xmlns:wpc="http://schemas.microsoft.com/office/word/2010/wordprocessingCanvas" xmlns:cx="http://schemas.microsoft.com/office/drawing/2014/chartex" xmlns:cx1="http://schemas.microsoft.com/office/drawing/2015/9/8/chartex" xmlns:cx2="http://schemas.microsoft.com/office/drawing/2015/10/21/chartex" xmlns:cx3="http://schemas.microsoft.com/office/drawing/2016/5/9/chartex" xmlns:cx4="http://schemas.microsoft.com/office/drawing/2016/5/10/chartex" xmlns:cx5="http://schemas.microsoft.com/office/drawing/2016/5/11/chartex" xmlns:cx6="http://schemas.microsoft.com/office/drawing/2016/5/12/chartex" xmlns:cx7="http://schemas.microsoft.com/office/drawing/2016/5/13/chartex" xmlns:cx8="http://schemas.microsoft.com/office/drawing/2016/5/14/chartex" xmlns:mc="http://schemas.openxmlformats.org/markup-compatibility/2006" xmlns:aink="http://schemas.microsoft.com/office/drawing/2016/ink" xmlns:am3d="http://schemas.microsoft.com/office/drawing/2017/model3d" xmlns:o="urn:schemas-microsoft-com:office:office" xmlns:oel="http://schemas.microsoft.com/office/2019/extlst" xmlns:r="http://schemas.openxmlformats.org/officeDocument/2006/relationships" xmlns:m="http://schemas.openxmlformats.org/officeDocument/2006/math" xmlns:v="urn:schemas-microsoft-com:vml" xmlns:wp14="http://schemas.microsoft.com/office/word/2010/wordprocessingDrawing" xmlns:wp="http://schemas.openxmlformats.org/drawingml/2006/wordprocessingDrawing" xmlns:w10="urn:schemas-microsoft-com:office:word" xmlns:w="http://schemas.openxmlformats.org/wordprocessingml/2006/main" xmlns:w14="http://schemas.microsoft.com/office/word/2010/wordml" xmlns:w15="http://schemas.microsoft.com/office/word/2012/wordml" xmlns:w16cex="http://schemas.microsoft.com/office/word/2018/wordml/cex" xmlns:w16cid="http://schemas.microsoft.com/office/word/2016/wordml/cid" xmlns:w16="http://schemas.microsoft.com/office/word/2018/wordml" xmlns:w16sdtdh="http://schemas.microsoft.com/office/word/2020/wordml/sdtdatahash" xmlns:w16se="http://schemas.microsoft.com/office/word/2015/wordml/symex" xmlns:wpg="http://schemas.microsoft.com/office/word/2010/wordprocessingGroup" xmlns:wpi="http://schemas.microsoft.com/office/word/2010/wordprocessingInk" xmlns:wne="http://schemas.microsoft.com/office/word/2006/wordml" xmlns:wps="http://schemas.microsoft.com/office/word/2010/wordprocessingShape" mc:Ignorable="w14 w15 w16se w16cid w16 w16cex w16sdtdh wp14">
+  <w:endnote w:type="separator" w:id="-1">
+    <w:p>
+      <w:pPr>
+        <w:spacing w:after="0" w:line="240" w:lineRule="auto"/>
+      </w:pPr>
+      <w:r>
+        <w:separator/>
+      </w:r>
+    </w:p>
+  </w:endnote>
+  <w:endnote w:type="continuationSeparator" w:id="0">
+    <w:p>
+      <w:pPr>
+        <w:spacing w:after="0" w:line="240" w:lineRule="auto"/>
+      </w:pPr>
+      <w:r>
+        <w:continuationSeparator/>
+      </w:r>
+    </w:p>
+  </w:endnote>
+</w:endnotes>
+</file>
+
+<file path=word/footnotes.xml><?xml version="1.0" encoding="utf-8"?>
+<w:footnotes xmlns:wpc="http://schemas.microsoft.com/office/word/2010/wordprocessingCanvas" xmlns:cx="http://schemas.microsoft.com/office/drawing/2014/chartex" xmlns:cx1="http://schemas.microsoft.com/office/drawing/2015/9/8/chartex" xmlns:cx2="http://schemas.microsoft.com/office/drawing/2015/10/21/chartex" xmlns:cx3="http://schemas.microsoft.com/office/drawing/2016/5/9/chartex" xmlns:cx4="http://schemas.microsoft.com/office/drawing/2016/5/10/chartex" xmlns:cx5="http://schemas.microsoft.com/office/drawing/2016/5/11/chartex" xmlns:cx6="http://schemas.microsoft.com/office/drawing/2016/5/12/chartex" xmlns:cx7="http://schemas.microsoft.com/office/drawing/2016/5/13/chartex" xmlns:cx8="http://schemas.microsoft.com/office/drawing/2016/5/14/chartex" xmlns:mc="http://schemas.openxmlformats.org/markup-compatibility/2006" xmlns:aink="http://schemas.microsoft.com/office/drawing/2016/ink" xmlns:am3d="http://schemas.microsoft.com/office/drawing/2017/model3d" xmlns:o="urn:schemas-microsoft-com:office:office" xmlns:oel="http://schemas.microsoft.com/office/2019/extlst" xmlns:r="http://schemas.openxmlformats.org/officeDocument/2006/relationships" xmlns:m="http://schemas.openxmlformats.org/officeDocument/2006/math" xmlns:v="urn:schemas-microsoft-com:vml" xmlns:wp14="http://schemas.microsoft.com/office/word/2010/wordprocessingDrawing" xmlns:wp="http://schemas.openxmlformats.org/drawingml/2006/wordprocessingDrawing" xmlns:w10="urn:schemas-microsoft-com:office:word" xmlns:w="http://schemas.openxmlformats.org/wordprocessingml/2006/main" xmlns:w14="http://schemas.microsoft.com/office/word/2010/wordml" xmlns:w15="http://schemas.microsoft.com/office/word/2012/wordml" xmlns:w16cex="http://schemas.microsoft.com/office/word/2018/wordml/cex" xmlns:w16cid="http://schemas.microsoft.com/office/word/2016/wordml/cid" xmlns:w16="http://schemas.microsoft.com/office/word/2018/wordml" xmlns:w16sdtdh="http://schemas.microsoft.com/office/word/2020/wordml/sdtdatahash" xmlns:w16se="http://schemas.microsoft.com/office/word/2015/wordml/symex" xmlns:wpg="http://schemas.microsoft.com/office/word/2010/wordprocessingGroup" xmlns:wpi="http://schemas.microsoft.com/office/word/2010/wordprocessingInk" xmlns:wne="http://schemas.microsoft.com/office/word/2006/wordml" xmlns:wps="http://schemas.microsoft.com/office/word/2010/wordprocessingShape" mc:Ignorable="w14 w15 w16se w16cid w16 w16cex w16sdtdh wp14">
+  <w:footnote w:type="separator" w:id="-1">
+    <w:p>
+      <w:pPr>
+        <w:spacing w:after="0" w:line="240" w:lineRule="auto"/>
+      </w:pPr>
+      <w:r>
+        <w:separator/>
+      </w:r>
+    </w:p>
+  </w:footnote>
+  <w:footnote w:type="continuationSeparator" w:id="0">
+    <w:p>
+      <w:pPr>
+        <w:spacing w:after="0" w:line="240" w:lineRule="auto"/>
+      </w:pPr>
+      <w:r>
+        <w:continuationSeparator/>
+      </w:r>
+    </w:p>
+  </w:footnote>
+</w:footnotes>
+</file>
+
 <file path=word/styles.xml><?xml version="1.0" encoding="utf-8"?>
-<w:styles xmlns:mc="http://schemas.openxmlformats.org/markup-compatibility/2006" xmlns:r="http://schemas.openxmlformats.org/officeDocument/2006/relationships" xmlns:w="http://schemas.openxmlformats.org/wordprocessingml/2006/main" xmlns:w14="http://schemas.microsoft.com/office/word/2010/wordml" xmlns:w15="http://schemas.microsoft.com/office/word/2012/wordml" xmlns:w16cex="http://schemas.microsoft.com/office/word/2018/wordml/cex" xmlns:w16cid="http://schemas.microsoft.com/office/word/2016/wordml/cid" xmlns:w16="http://schemas.microsoft.com/office/word/2018/wordml" xmlns:w16du="http://schemas.microsoft.com/office/word/2023/wordml/word16du" xmlns:w16sdtdh="http://schemas.microsoft.com/office/word/2020/wordml/sdtdatahash" xmlns:w16sdtfl="http://schemas.microsoft.com/office/word/2024/wordml/sdtformatlock" xmlns:w16se="http://schemas.microsoft.com/office/word/2015/wordml/symex" mc:Ignorable="w14 w15 w16se w16cid w16 w16cex w16sdtdh w16sdtfl w16du">
+<w:styles xmlns:mc="http://schemas.openxmlformats.org/markup-compatibility/2006" xmlns:r="http://schemas.openxmlformats.org/officeDocument/2006/relationships" xmlns:w="http://schemas.openxmlformats.org/wordprocessingml/2006/main" xmlns:w14="http://schemas.microsoft.com/office/word/2010/wordml" xmlns:w15="http://schemas.microsoft.com/office/word/2012/wordml" xmlns:w16cex="http://schemas.microsoft.com/office/word/2018/wordml/cex" xmlns:w16cid="http://schemas.microsoft.com/office/word/2016/wordml/cid" xmlns:w16="http://schemas.microsoft.com/office/word/2018/wordml" xmlns:w16sdtdh="http://schemas.microsoft.com/office/word/2020/wordml/sdtdatahash" xmlns:w16se="http://schemas.microsoft.com/office/word/2015/wordml/symex" mc:Ignorable="w14 w15 w16se w16cid w16 w16cex w16sdtdh">
   <w:docDefaults>
     <w:rPrDefault>
       <w:rPr>
@@ -5124,6 +5003,7 @@
   <w:style w:type="character" w:default="1" w:styleId="Fuentedeprrafopredeter">
     <w:name w:val="Default Paragraph Font"/>
     <w:uiPriority w:val="1"/>
+    <w:semiHidden/>
     <w:unhideWhenUsed/>
   </w:style>
   <w:style w:type="table" w:default="1" w:styleId="Tablanormal">
@@ -5460,6 +5340,50 @@
       <w:shd w:val="clear" w:color="auto" w:fill="E1DFDD"/>
     </w:rPr>
   </w:style>
+  <w:style w:type="paragraph" w:styleId="Encabezado">
+    <w:name w:val="header"/>
+    <w:basedOn w:val="Normal"/>
+    <w:link w:val="EncabezadoCar"/>
+    <w:uiPriority w:val="99"/>
+    <w:unhideWhenUsed/>
+    <w:rsid w:val="00B25516"/>
+    <w:pPr>
+      <w:tabs>
+        <w:tab w:val="center" w:pos="4419"/>
+        <w:tab w:val="right" w:pos="8838"/>
+      </w:tabs>
+      <w:spacing w:after="0" w:line="240" w:lineRule="auto"/>
+    </w:pPr>
+  </w:style>
+  <w:style w:type="character" w:customStyle="1" w:styleId="EncabezadoCar">
+    <w:name w:val="Encabezado Car"/>
+    <w:basedOn w:val="Fuentedeprrafopredeter"/>
+    <w:link w:val="Encabezado"/>
+    <w:uiPriority w:val="99"/>
+    <w:rsid w:val="00B25516"/>
+  </w:style>
+  <w:style w:type="paragraph" w:styleId="Piedepgina">
+    <w:name w:val="footer"/>
+    <w:basedOn w:val="Normal"/>
+    <w:link w:val="PiedepginaCar"/>
+    <w:uiPriority w:val="99"/>
+    <w:unhideWhenUsed/>
+    <w:rsid w:val="00B25516"/>
+    <w:pPr>
+      <w:tabs>
+        <w:tab w:val="center" w:pos="4419"/>
+        <w:tab w:val="right" w:pos="8838"/>
+      </w:tabs>
+      <w:spacing w:after="0" w:line="240" w:lineRule="auto"/>
+    </w:pPr>
+  </w:style>
+  <w:style w:type="character" w:customStyle="1" w:styleId="PiedepginaCar">
+    <w:name w:val="Pie de página Car"/>
+    <w:basedOn w:val="Fuentedeprrafopredeter"/>
+    <w:link w:val="Piedepgina"/>
+    <w:uiPriority w:val="99"/>
+    <w:rsid w:val="00B25516"/>
+  </w:style>
 </w:styles>
 </file>
 

</xml_diff>